<commit_message>
Logo oben links: echtes ASANTIAL-Logo (weiß/dunkel je nach Slide)
Co-Authored-By: Claude Opus 4.6 (1M context) <noreply@anthropic.com>
</commit_message>
<xml_diff>
--- a/Moderationsleitfaden-V2.docx
+++ b/Moderationsleitfaden-V2.docx
@@ -1326,34 +1326,44 @@
         <w:spacing w:after="200"/>
       </w:pPr>
       <w:r>
-        <w:t>[Erste Karte klicken] Projektmodus → Kontinuierliche Arbeit. Employer Branding ist kein Projekt mit Anfang und Ende. Es ist wie Unternehmenskommunikation oder Buchhaltung – es hört nie auf. Aber die meisten Unternehmen behandeln es wie ein Projekt: Budget beantragen, Agentur beauftragen, Ergebnis abholen, fertig. Und dann wundert man sich, warum nach sechs Monaten nichts mehr davon übrig ist.</w:t>
-      </w:r>
-    </w:p>
-    <w:p>
-      <w:pPr>
-        <w:spacing w:after="200"/>
-      </w:pPr>
-    </w:p>
-    <w:p>
-      <w:pPr>
-        <w:spacing w:after="200"/>
-      </w:pPr>
-      <w:r>
-        <w:t>[Zweite Karte klicken] Aktionismus → Wirkung. Weniger machen – aber das Richtige. Ich sehe Unternehmen, die gleichzeitig auf fünf Plattformen posten, drei Messen besuchen und eine Kampagne fahren. Und am Ende kann niemand sagen, was davon funktioniert hat. Die Frage ist nicht: Was können wir noch alles tun? Sondern: Was davon zahlt wirklich auf unser Ziel ein?</w:t>
-      </w:r>
-    </w:p>
-    <w:p>
-      <w:pPr>
-        <w:spacing w:after="200"/>
-      </w:pPr>
-    </w:p>
-    <w:p>
-      <w:pPr>
-        <w:spacing w:after="200"/>
-      </w:pPr>
-      <w:r>
-        <w:lastRenderedPageBreak/>
-        <w:t>[Dritte Karte klicken] Reagieren müssen → Gestalten können. Das ist vielleicht der wichtigste Punkt. Solange ihr nur auf Anfragen reagiert, seid ihr Dienstleister im eigenen Unternehmen. Ihr müsst in die Position kommen, selbst die Richtung vorzugeben. Das geht – aber nur mit einem strategischen Fundament.</w:t>
+        <w:rPr>
+          <w:b/>
+          <w:bCs/>
+        </w:rPr>
+        <w:t xml:space="preserve">[Erste Karte klicken] </w:t>
+      </w:r>
+      <w:r>
+        <w:t>Projektmodus → Kontinuierliche Arbeit. Employer Branding ist kein Projekt mit Anfang und Ende. Es ist wie Unternehmenskommunikation oder Buchhaltung – es hört nie auf. Aber die meisten Unternehmen behandeln es wie ein Projekt: Budget beantragen, Agentur beauftragen, Ergebnis abholen, fertig. Und dann wundert man sich, warum nach sechs Monaten nichts mehr davon übrig ist.</w:t>
+      </w:r>
+    </w:p>
+    <w:p>
+      <w:pPr>
+        <w:spacing w:after="200"/>
+      </w:pPr>
+      <w:r>
+        <w:rPr>
+          <w:b/>
+          <w:bCs/>
+        </w:rPr>
+        <w:t>[Zweite Karte klicken]</w:t>
+      </w:r>
+      <w:r>
+        <w:t xml:space="preserve"> Aktionismus → Wirkung. Weniger machen – aber das Richtige. Ich sehe Unternehmen, die gleichzeitig auf fünf Plattformen posten, drei Messen besuchen und eine Kampagne fahren. Und am Ende kann niemand sagen, was davon funktioniert hat. Die Frage ist nicht: Was können wir noch alles tun? Sondern: Was davon zahlt wirklich auf unser Ziel ein?</w:t>
+      </w:r>
+    </w:p>
+    <w:p>
+      <w:pPr>
+        <w:spacing w:after="200"/>
+      </w:pPr>
+      <w:r>
+        <w:rPr>
+          <w:b/>
+          <w:bCs/>
+        </w:rPr>
+        <w:t>[Dritte Karte klicken]</w:t>
+      </w:r>
+      <w:r>
+        <w:t xml:space="preserve"> Reagieren müssen → Gestalten können. Das ist vielleicht der wichtigste Punkt. Solange ihr nur auf Anfragen reagiert, seid ihr Dienstleister im eigenen Unternehmen. Ihr müsst in die Position kommen, selbst die Richtung vorzugeben. Das geht – aber nur mit einem strategischen Fundament.</w:t>
       </w:r>
     </w:p>
     <w:p>
@@ -1402,10 +1412,188 @@
         <w:t xml:space="preserve">Moderation: </w:t>
       </w:r>
       <w:r>
-        <w:t>[Pause. Frage wirken lassen. 3-4 Sekunden Stille.] Das ist keine rhetorische Frage. Was kostet es – an Energie, an verlorenen Kandidaten, an Glaubwürdigkeit intern? Und jetzt schauen wir uns an, wie es anders geht.</w:t>
-      </w:r>
-    </w:p>
-    <w:p>
+        <w:t>[Pause. 3-4 Sekunden Stille.]</w:t>
+      </w:r>
+    </w:p>
+    <w:p>
+      <w:pPr>
+        <w:spacing w:after="200"/>
+      </w:pPr>
+      <w:r>
+        <w:t>Das ist keine rhetorische Frage. Rechnen wir mal kurz zusammen.</w:t>
+      </w:r>
+    </w:p>
+    <w:p>
+      <w:pPr>
+        <w:spacing w:after="200"/>
+      </w:pPr>
+      <w:r>
+        <w:t xml:space="preserve">Eine unbesetzte Stelle kostet ein Unternehmen im Schnitt 29.000 Euro – pro Quartal. Das sind entgangene Produktivität, Überstunden im Team, verlorene Aufträge. Bei drei offenen Stellen reden wir über fast 350.000 Euro im Jahr. Das sind nicht meine Zahlen – das sind Branchendurchschnitte von </w:t>
+      </w:r>
+      <w:proofErr w:type="spellStart"/>
+      <w:r>
+        <w:t>Stepstone</w:t>
+      </w:r>
+      <w:proofErr w:type="spellEnd"/>
+      <w:r>
+        <w:t xml:space="preserve"> und SHRM.</w:t>
+      </w:r>
+    </w:p>
+    <w:p>
+      <w:pPr>
+        <w:spacing w:after="200"/>
+      </w:pPr>
+      <w:r>
+        <w:t>Jetzt kommt der Teil, den niemand rechnet: Was kostet euch die Fluktuation, die entsteht, weil das Team überlastet ist? Was kostet euch die Agentur, die alle sechs Monate ein neues Kampagnenkonzept baut, das nach drei Monaten wieder in der Schublade liegt? Was kostet euch der Reputationsverlust auf Kununu, weil niemand Zeit hat, die Bewertungen zu managen?</w:t>
+      </w:r>
+    </w:p>
+    <w:p>
+      <w:pPr>
+        <w:spacing w:after="200"/>
+      </w:pPr>
+      <w:r>
+        <w:t>Und was kostet es euch persönlich – an Energie, an Glaubwürdigkeit intern, an dem Gefühl, nie das zu tun, wofür ihr eigentlich angetreten seid?</w:t>
+      </w:r>
+    </w:p>
+    <w:p>
+      <w:pPr>
+        <w:spacing w:after="200"/>
+      </w:pPr>
+      <w:r>
+        <w:t>[Kurze Pause]</w:t>
+      </w:r>
+    </w:p>
+    <w:p>
+      <w:pPr>
+        <w:spacing w:after="200"/>
+      </w:pPr>
+      <w:r>
+        <w:t>Die Frage ist nicht, ob ihr euch Veränderung leisten könnt. Die Frage ist, ob ihr es euch leisten könnt, nichts zu ändern. Und jetzt schauen wir uns an, wie es anders geht.</w:t>
+      </w:r>
+    </w:p>
+    <w:p>
+      <w:pPr>
+        <w:spacing w:after="200"/>
+      </w:pPr>
+    </w:p>
+    <w:p>
+      <w:pPr>
+        <w:spacing w:after="200"/>
+        <w:rPr>
+          <w:b/>
+          <w:bCs/>
+          <w:color w:val="4EA72E" w:themeColor="accent6"/>
+        </w:rPr>
+      </w:pPr>
+      <w:r>
+        <w:rPr>
+          <w:b/>
+          <w:bCs/>
+          <w:color w:val="4EA72E" w:themeColor="accent6"/>
+        </w:rPr>
+        <w:t>Zahlen zum Merken (falls jemand nachfragt):</w:t>
+      </w:r>
+    </w:p>
+    <w:p>
+      <w:pPr>
+        <w:pStyle w:val="Listenabsatz"/>
+        <w:numPr>
+          <w:ilvl w:val="0"/>
+          <w:numId w:val="4"/>
+        </w:numPr>
+        <w:spacing w:after="200"/>
+        <w:rPr>
+          <w:color w:val="4EA72E" w:themeColor="accent6"/>
+        </w:rPr>
+      </w:pPr>
+      <w:r>
+        <w:rPr>
+          <w:color w:val="4EA72E" w:themeColor="accent6"/>
+        </w:rPr>
+        <w:t>Unbesetzte Stelle: ~29.000 €/Quartal (</w:t>
+      </w:r>
+      <w:proofErr w:type="spellStart"/>
+      <w:r>
+        <w:rPr>
+          <w:color w:val="4EA72E" w:themeColor="accent6"/>
+        </w:rPr>
+        <w:t>Stepstone</w:t>
+      </w:r>
+      <w:proofErr w:type="spellEnd"/>
+      <w:r>
+        <w:rPr>
+          <w:color w:val="4EA72E" w:themeColor="accent6"/>
+        </w:rPr>
+        <w:t xml:space="preserve"> Fachkräfteatlas)</w:t>
+      </w:r>
+    </w:p>
+    <w:p>
+      <w:pPr>
+        <w:pStyle w:val="Listenabsatz"/>
+        <w:numPr>
+          <w:ilvl w:val="0"/>
+          <w:numId w:val="4"/>
+        </w:numPr>
+        <w:spacing w:after="200"/>
+        <w:rPr>
+          <w:color w:val="4EA72E" w:themeColor="accent6"/>
+        </w:rPr>
+      </w:pPr>
+      <w:r>
+        <w:rPr>
+          <w:color w:val="4EA72E" w:themeColor="accent6"/>
+        </w:rPr>
+        <w:t>Time-</w:t>
+      </w:r>
+      <w:proofErr w:type="spellStart"/>
+      <w:r>
+        <w:rPr>
+          <w:color w:val="4EA72E" w:themeColor="accent6"/>
+        </w:rPr>
+        <w:t>to</w:t>
+      </w:r>
+      <w:proofErr w:type="spellEnd"/>
+      <w:r>
+        <w:rPr>
+          <w:color w:val="4EA72E" w:themeColor="accent6"/>
+        </w:rPr>
+        <w:t>-Hire Deutschland Durchschnitt: 132 Tage</w:t>
+      </w:r>
+    </w:p>
+    <w:p>
+      <w:pPr>
+        <w:pStyle w:val="Listenabsatz"/>
+        <w:numPr>
+          <w:ilvl w:val="0"/>
+          <w:numId w:val="4"/>
+        </w:numPr>
+        <w:spacing w:after="200"/>
+        <w:rPr>
+          <w:color w:val="4EA72E" w:themeColor="accent6"/>
+        </w:rPr>
+      </w:pPr>
+      <w:r>
+        <w:rPr>
+          <w:color w:val="4EA72E" w:themeColor="accent6"/>
+        </w:rPr>
+        <w:t>Frühfluktuation im ersten Jahr: ca. 30% (eine Fehlbesetzung kostet das 1-2-fache Jahresgehalt)</w:t>
+      </w:r>
+    </w:p>
+    <w:p>
+      <w:pPr>
+        <w:pStyle w:val="Listenabsatz"/>
+        <w:numPr>
+          <w:ilvl w:val="0"/>
+          <w:numId w:val="4"/>
+        </w:numPr>
+        <w:spacing w:after="200"/>
+      </w:pPr>
+      <w:r>
+        <w:rPr>
+          <w:color w:val="4EA72E" w:themeColor="accent6"/>
+        </w:rPr>
+        <w:t>Durchschnittliche Agenturkosten für eine EB-Kampagne: 15.000–40.000 €</w:t>
+      </w:r>
       <w:r>
         <w:br w:type="page"/>
       </w:r>
@@ -1775,6 +1963,38 @@
       <w:proofErr w:type="spellEnd"/>
       <w:r>
         <w:t xml:space="preserve"> durch den gesamten Prozess. Und: Unabhängigkeit von Agenturen.</w:t>
+      </w:r>
+    </w:p>
+    <w:p>
+      <w:pPr>
+        <w:spacing w:after="200"/>
+      </w:pPr>
+      <w:r>
+        <w:t xml:space="preserve">Wir haben es so einfach wie möglich gebaut. Wie </w:t>
+      </w:r>
+      <w:proofErr w:type="spellStart"/>
+      <w:r>
+        <w:t>chstgpt</w:t>
+      </w:r>
+      <w:proofErr w:type="spellEnd"/>
+      <w:r>
+        <w:t>. Einsprechen, oder schreiben. Und schon geht es los.</w:t>
+      </w:r>
+    </w:p>
+    <w:p>
+      <w:pPr>
+        <w:spacing w:after="200"/>
+      </w:pPr>
+      <w:r>
+        <w:t>Ein Personal Assistent für dich, der dir unzählig viele Aufgaben abnimmt.</w:t>
+      </w:r>
+    </w:p>
+    <w:p>
+      <w:pPr>
+        <w:spacing w:after="200"/>
+      </w:pPr>
+      <w:r>
+        <w:t>In 5 Jahren wird es firmen geben die nur durch und mit KI entstanden sind. ASANTIAL ist wohl die einfachste und sicherste Art KI in HR einzuführen.</w:t>
       </w:r>
     </w:p>
     <w:p>
@@ -2616,6 +2836,119 @@
     </w:lvl>
   </w:abstractNum>
   <w:abstractNum w:abstractNumId="1" w15:restartNumberingAfterBreak="0">
+    <w:nsid w:val="430A2B7F"/>
+    <w:multiLevelType w:val="hybridMultilevel"/>
+    <w:tmpl w:val="C81C5BB6"/>
+    <w:lvl w:ilvl="0" w:tplc="04070001">
+      <w:start w:val="1"/>
+      <w:numFmt w:val="bullet"/>
+      <w:lvlText w:val=""/>
+      <w:lvlJc w:val="left"/>
+      <w:pPr>
+        <w:ind w:left="720" w:hanging="360"/>
+      </w:pPr>
+      <w:rPr>
+        <w:rFonts w:ascii="Symbol" w:hAnsi="Symbol" w:hint="default"/>
+      </w:rPr>
+    </w:lvl>
+    <w:lvl w:ilvl="1" w:tplc="04070003" w:tentative="1">
+      <w:start w:val="1"/>
+      <w:numFmt w:val="bullet"/>
+      <w:lvlText w:val="o"/>
+      <w:lvlJc w:val="left"/>
+      <w:pPr>
+        <w:ind w:left="1440" w:hanging="360"/>
+      </w:pPr>
+      <w:rPr>
+        <w:rFonts w:ascii="Courier New" w:hAnsi="Courier New" w:cs="Courier New" w:hint="default"/>
+      </w:rPr>
+    </w:lvl>
+    <w:lvl w:ilvl="2" w:tplc="04070005" w:tentative="1">
+      <w:start w:val="1"/>
+      <w:numFmt w:val="bullet"/>
+      <w:lvlText w:val=""/>
+      <w:lvlJc w:val="left"/>
+      <w:pPr>
+        <w:ind w:left="2160" w:hanging="360"/>
+      </w:pPr>
+      <w:rPr>
+        <w:rFonts w:ascii="Wingdings" w:hAnsi="Wingdings" w:hint="default"/>
+      </w:rPr>
+    </w:lvl>
+    <w:lvl w:ilvl="3" w:tplc="04070001" w:tentative="1">
+      <w:start w:val="1"/>
+      <w:numFmt w:val="bullet"/>
+      <w:lvlText w:val=""/>
+      <w:lvlJc w:val="left"/>
+      <w:pPr>
+        <w:ind w:left="2880" w:hanging="360"/>
+      </w:pPr>
+      <w:rPr>
+        <w:rFonts w:ascii="Symbol" w:hAnsi="Symbol" w:hint="default"/>
+      </w:rPr>
+    </w:lvl>
+    <w:lvl w:ilvl="4" w:tplc="04070003" w:tentative="1">
+      <w:start w:val="1"/>
+      <w:numFmt w:val="bullet"/>
+      <w:lvlText w:val="o"/>
+      <w:lvlJc w:val="left"/>
+      <w:pPr>
+        <w:ind w:left="3600" w:hanging="360"/>
+      </w:pPr>
+      <w:rPr>
+        <w:rFonts w:ascii="Courier New" w:hAnsi="Courier New" w:cs="Courier New" w:hint="default"/>
+      </w:rPr>
+    </w:lvl>
+    <w:lvl w:ilvl="5" w:tplc="04070005" w:tentative="1">
+      <w:start w:val="1"/>
+      <w:numFmt w:val="bullet"/>
+      <w:lvlText w:val=""/>
+      <w:lvlJc w:val="left"/>
+      <w:pPr>
+        <w:ind w:left="4320" w:hanging="360"/>
+      </w:pPr>
+      <w:rPr>
+        <w:rFonts w:ascii="Wingdings" w:hAnsi="Wingdings" w:hint="default"/>
+      </w:rPr>
+    </w:lvl>
+    <w:lvl w:ilvl="6" w:tplc="04070001" w:tentative="1">
+      <w:start w:val="1"/>
+      <w:numFmt w:val="bullet"/>
+      <w:lvlText w:val=""/>
+      <w:lvlJc w:val="left"/>
+      <w:pPr>
+        <w:ind w:left="5040" w:hanging="360"/>
+      </w:pPr>
+      <w:rPr>
+        <w:rFonts w:ascii="Symbol" w:hAnsi="Symbol" w:hint="default"/>
+      </w:rPr>
+    </w:lvl>
+    <w:lvl w:ilvl="7" w:tplc="04070003" w:tentative="1">
+      <w:start w:val="1"/>
+      <w:numFmt w:val="bullet"/>
+      <w:lvlText w:val="o"/>
+      <w:lvlJc w:val="left"/>
+      <w:pPr>
+        <w:ind w:left="5760" w:hanging="360"/>
+      </w:pPr>
+      <w:rPr>
+        <w:rFonts w:ascii="Courier New" w:hAnsi="Courier New" w:cs="Courier New" w:hint="default"/>
+      </w:rPr>
+    </w:lvl>
+    <w:lvl w:ilvl="8" w:tplc="04070005" w:tentative="1">
+      <w:start w:val="1"/>
+      <w:numFmt w:val="bullet"/>
+      <w:lvlText w:val=""/>
+      <w:lvlJc w:val="left"/>
+      <w:pPr>
+        <w:ind w:left="6480" w:hanging="360"/>
+      </w:pPr>
+      <w:rPr>
+        <w:rFonts w:ascii="Wingdings" w:hAnsi="Wingdings" w:hint="default"/>
+      </w:rPr>
+    </w:lvl>
+  </w:abstractNum>
+  <w:abstractNum w:abstractNumId="2" w15:restartNumberingAfterBreak="0">
     <w:nsid w:val="66081434"/>
     <w:multiLevelType w:val="hybridMultilevel"/>
     <w:tmpl w:val="6E44BF96"/>
@@ -2669,7 +3002,7 @@
       <w:lvlJc w:val="left"/>
     </w:lvl>
   </w:abstractNum>
-  <w:abstractNum w:abstractNumId="2" w15:restartNumberingAfterBreak="0">
+  <w:abstractNum w:abstractNumId="3" w15:restartNumberingAfterBreak="0">
     <w:nsid w:val="6D6344DA"/>
     <w:multiLevelType w:val="hybridMultilevel"/>
     <w:tmpl w:val="4F481376"/>
@@ -2756,19 +3089,22 @@
     </w:lvl>
   </w:abstractNum>
   <w:num w:numId="1" w16cid:durableId="1472863105">
-    <w:abstractNumId w:val="2"/>
+    <w:abstractNumId w:val="3"/>
     <w:lvlOverride w:ilvl="0">
       <w:startOverride w:val="1"/>
     </w:lvlOverride>
   </w:num>
   <w:num w:numId="2" w16cid:durableId="197788836">
-    <w:abstractNumId w:val="1"/>
+    <w:abstractNumId w:val="2"/>
     <w:lvlOverride w:ilvl="0">
       <w:startOverride w:val="1"/>
     </w:lvlOverride>
   </w:num>
   <w:num w:numId="3" w16cid:durableId="2033846462">
     <w:abstractNumId w:val="0"/>
+  </w:num>
+  <w:num w:numId="4" w16cid:durableId="58409883">
+    <w:abstractNumId w:val="1"/>
   </w:num>
 </w:numbering>
 </file>

</xml_diff>